<commit_message>
DA III document: VIT logo, faculty name, demo-unavailable note
</commit_message>
<xml_diff>
--- a/paper/CollabDoc_DA3_BCSE355L.docx
+++ b/paper/CollabDoc_DA3_BCSE355L.docx
@@ -23,25 +23,51 @@
       <w:tr>
         <w:tc>
           <w:tcPr>
-            <w:tcW w:type="dxa" w:w="2016"/>
+            <w:tcW w:type="dxa" w:w="2304"/>
           </w:tcPr>
           <w:p>
             <w:pPr>
               <w:jc w:val="center"/>
             </w:pPr>
             <w:r>
-              <w:rPr>
-                <w:rFonts w:ascii="Times New Roman" w:hAnsi="Times New Roman" w:cs="Times New Roman" w:eastAsia="Times New Roman"/>
-                <w:i/>
-                <w:sz w:val="20"/>
-              </w:rPr>
-              <w:t>[VIT logo]</w:t>
+              <w:drawing>
+                <wp:inline xmlns:a="http://schemas.openxmlformats.org/drawingml/2006/main" xmlns:pic="http://schemas.openxmlformats.org/drawingml/2006/picture">
+                  <wp:extent cx="1234440" cy="439176"/>
+                  <wp:docPr id="1" name="Picture 1"/>
+                  <wp:cNvGraphicFramePr>
+                    <a:graphicFrameLocks noChangeAspect="1"/>
+                  </wp:cNvGraphicFramePr>
+                  <a:graphic>
+                    <a:graphicData uri="http://schemas.openxmlformats.org/drawingml/2006/picture">
+                      <pic:pic>
+                        <pic:nvPicPr>
+                          <pic:cNvPr id="0" name="vitlogo.png"/>
+                          <pic:cNvPicPr/>
+                        </pic:nvPicPr>
+                        <pic:blipFill>
+                          <a:blip r:embed="rId9"/>
+                          <a:stretch>
+                            <a:fillRect/>
+                          </a:stretch>
+                        </pic:blipFill>
+                        <pic:spPr>
+                          <a:xfrm>
+                            <a:off x="0" y="0"/>
+                            <a:ext cx="1234440" cy="439176"/>
+                          </a:xfrm>
+                          <a:prstGeom prst="rect"/>
+                        </pic:spPr>
+                      </pic:pic>
+                    </a:graphicData>
+                  </a:graphic>
+                </wp:inline>
+              </w:drawing>
             </w:r>
           </w:p>
         </w:tc>
         <w:tc>
           <w:tcPr>
-            <w:tcW w:type="dxa" w:w="7344"/>
+            <w:tcW w:type="dxa" w:w="7056"/>
           </w:tcPr>
           <w:p>
             <w:pPr>
@@ -257,7 +283,7 @@
           <w:i w:val="0"/>
           <w:sz w:val="22"/>
         </w:rPr>
-        <w:t>Faculty: [faculty name]</w:t>
+        <w:t>Faculty: S Vigneshwari</w:t>
       </w:r>
     </w:p>
     <w:p>
@@ -305,7 +331,7 @@
           <w:i w:val="0"/>
           <w:sz w:val="22"/>
         </w:rPr>
-        <w:t>CollabDoc lets several people edit one document at the same time and then tells them who wrote which part. Edits are merged by a server-side operational transformation (OT) engine so that every client converges on identical text. A keystroke ledger records who typed each character, and a dependency-free softmax classifier over 44 stylometric features forms an independent opinion about the writing style of each block; the two are blended into a per-block confidence score. Because a document's editing state lives in the memory of one process, scaling it is a cloud-architecture problem, and this project treats it as one. The system is deployed on AWS as a k3s Kubernetes cluster on a single EC2 instance in ap-south-1 with three application pods, Kafka for cross-pod events, a Caddy router that hashes the document id so each document always reaches the same pod, RDS PostgreSQL in private subnets, S3 for uploads, ECR for images, and CloudWatch alarms and a budget for operations. The whole stack is described in Terraform and runs for about US$2.5 per day. On a development machine an edit was acknowledged in 2.3 ms median (3.9 ms p95) against a 200 ms requirement, and the OT engine converged on 2000 of 2000 random concurrent-edit pairs.</w:t>
+        <w:t>CollabDoc lets several people edit one document at the same time and then tells them who wrote which part. Edits are merged by a server-side operational transformation (OT) engine so that every client converges on identical text. A keystroke ledger records who typed each character, and a dependency-free softmax classifier over 44 stylometric features forms an independent opinion about the writing style of each block; the two are blended into a per-block confidence score. Because a document's editing state lives in the memory of one process, scaling it is a cloud-architecture problem, and this project treats it as one. The system was deployed on AWS as a k3s Kubernetes cluster on a single EC2 instance in ap-south-1 with three application pods, Kafka for cross-pod events, a Caddy router that hashes the document id so each document always reaches the same pod, RDS PostgreSQL in private subnets, S3 for uploads, ECR for images, and CloudWatch alarms and a budget for operations. The whole stack is described in Terraform and cost about US$2.5 per day while running; it has since been torn down because the AWS credits were used up. On a development machine an edit was acknowledged in 2.3 ms median (3.9 ms p95) against a 200 ms requirement, and the OT engine converged on 2000 of 2000 random concurrent-edit pairs.</w:t>
       </w:r>
     </w:p>
     <w:p>
@@ -576,14 +602,14 @@
           <w:b/>
           <w:sz w:val="22"/>
         </w:rPr>
-        <w:t xml:space="preserve">Citation (if a corpus is later archived): </w:t>
+        <w:t xml:space="preserve">Citation (no dataset DOI; reserved if a corpus is later archived): </w:t>
       </w:r>
       <w:r>
         <w:rPr>
           <w:rFonts w:ascii="Times New Roman" w:hAnsi="Times New Roman" w:cs="Times New Roman" w:eastAsia="Times New Roman"/>
           <w:sz w:val="22"/>
         </w:rPr>
-        <w:t>Nitish Kumar, Balan N, [faculty name], "CollabDoc collaborative-writing corpus," Zenodo, [DOI to be assigned].</w:t>
+        <w:t>Nitish Kumar, Balan N, S Vigneshwari, "CollabDoc collaborative-writing corpus," Zenodo, [DOI to be assigned].</w:t>
       </w:r>
     </w:p>
     <w:p>
@@ -615,7 +641,7 @@
           <w:i w:val="0"/>
           <w:sz w:val="22"/>
         </w:rPr>
-        <w:t>[demo URL]. The AWS stack is started and stopped on demand to save credits (deploy/start.ps1 and stop.ps1), so a live link only works while it is running.</w:t>
+        <w:t>Not available. The project was deployed on AWS (k3s on EC2, RDS, S3, ECR) and demonstrated live, but the AWS free-plan credits have been used up and the stack has been torn down, so there is no live demo URL. The full deployment can be recreated from the repository with Terraform and deploy/deploy.ps1, and the screenshots, results and deployment configuration are included in this document and in the repository.</w:t>
       </w:r>
     </w:p>
     <w:p>
@@ -669,7 +695,7 @@
           <w:rFonts w:ascii="Times New Roman" w:hAnsi="Times New Roman" w:cs="Times New Roman" w:eastAsia="Times New Roman"/>
           <w:sz w:val="22"/>
         </w:rPr>
-        <w:t>Nitish Kumar, Balan N, [faculty name], "CollabDoc: A Real-Time Collaborative Document Editor with Operational Transformation and Stylometric Authorship Attribution," GitHub repository, https://github.com/Zerko-sd/CollabDoc.</w:t>
+        <w:t>Nitish Kumar, Balan N, S Vigneshwari, "CollabDoc: A Real-Time Collaborative Document Editor with Operational Transformation and Stylometric Authorship Attribution," GitHub repository, https://github.com/Zerko-sd/CollabDoc.</w:t>
       </w:r>
     </w:p>
     <w:p>
@@ -714,7 +740,7 @@
         <w:drawing>
           <wp:inline xmlns:a="http://schemas.openxmlformats.org/drawingml/2006/main" xmlns:pic="http://schemas.openxmlformats.org/drawingml/2006/picture">
             <wp:extent cx="3657600" cy="2293545"/>
-            <wp:docPr id="1" name="Picture 1"/>
+            <wp:docPr id="2" name="Picture 2"/>
             <wp:cNvGraphicFramePr>
               <a:graphicFrameLocks noChangeAspect="1"/>
             </wp:cNvGraphicFramePr>
@@ -726,7 +752,7 @@
                     <pic:cNvPicPr/>
                   </pic:nvPicPr>
                   <pic:blipFill>
-                    <a:blip r:embed="rId9"/>
+                    <a:blip r:embed="rId10"/>
                     <a:stretch>
                       <a:fillRect/>
                     </a:stretch>
@@ -787,7 +813,7 @@
         <w:drawing>
           <wp:inline xmlns:a="http://schemas.openxmlformats.org/drawingml/2006/main" xmlns:pic="http://schemas.openxmlformats.org/drawingml/2006/picture">
             <wp:extent cx="5120640" cy="3154764"/>
-            <wp:docPr id="2" name="Picture 2"/>
+            <wp:docPr id="3" name="Picture 3"/>
             <wp:cNvGraphicFramePr>
               <a:graphicFrameLocks noChangeAspect="1"/>
             </wp:cNvGraphicFramePr>
@@ -799,7 +825,7 @@
                     <pic:cNvPicPr/>
                   </pic:nvPicPr>
                   <pic:blipFill>
-                    <a:blip r:embed="rId10"/>
+                    <a:blip r:embed="rId11"/>
                     <a:stretch>
                       <a:fillRect/>
                     </a:stretch>
@@ -1382,7 +1408,7 @@
         <w:drawing>
           <wp:inline xmlns:a="http://schemas.openxmlformats.org/drawingml/2006/main" xmlns:pic="http://schemas.openxmlformats.org/drawingml/2006/picture">
             <wp:extent cx="5303520" cy="3314700"/>
-            <wp:docPr id="3" name="Picture 3"/>
+            <wp:docPr id="4" name="Picture 4"/>
             <wp:cNvGraphicFramePr>
               <a:graphicFrameLocks noChangeAspect="1"/>
             </wp:cNvGraphicFramePr>
@@ -1394,7 +1420,7 @@
                     <pic:cNvPicPr/>
                   </pic:nvPicPr>
                   <pic:blipFill>
-                    <a:blip r:embed="rId11"/>
+                    <a:blip r:embed="rId12"/>
                     <a:stretch>
                       <a:fillRect/>
                     </a:stretch>
@@ -1439,7 +1465,7 @@
         <w:drawing>
           <wp:inline xmlns:a="http://schemas.openxmlformats.org/drawingml/2006/main" xmlns:pic="http://schemas.openxmlformats.org/drawingml/2006/picture">
             <wp:extent cx="5303520" cy="3314700"/>
-            <wp:docPr id="4" name="Picture 4"/>
+            <wp:docPr id="5" name="Picture 5"/>
             <wp:cNvGraphicFramePr>
               <a:graphicFrameLocks noChangeAspect="1"/>
             </wp:cNvGraphicFramePr>
@@ -1451,7 +1477,7 @@
                     <pic:cNvPicPr/>
                   </pic:nvPicPr>
                   <pic:blipFill>
-                    <a:blip r:embed="rId12"/>
+                    <a:blip r:embed="rId13"/>
                     <a:stretch>
                       <a:fillRect/>
                     </a:stretch>
@@ -1496,7 +1522,7 @@
         <w:drawing>
           <wp:inline xmlns:a="http://schemas.openxmlformats.org/drawingml/2006/main" xmlns:pic="http://schemas.openxmlformats.org/drawingml/2006/picture">
             <wp:extent cx="5303520" cy="3314700"/>
-            <wp:docPr id="5" name="Picture 5"/>
+            <wp:docPr id="6" name="Picture 6"/>
             <wp:cNvGraphicFramePr>
               <a:graphicFrameLocks noChangeAspect="1"/>
             </wp:cNvGraphicFramePr>
@@ -1508,7 +1534,7 @@
                     <pic:cNvPicPr/>
                   </pic:nvPicPr>
                   <pic:blipFill>
-                    <a:blip r:embed="rId13"/>
+                    <a:blip r:embed="rId14"/>
                     <a:stretch>
                       <a:fillRect/>
                     </a:stretch>
@@ -1553,7 +1579,7 @@
         <w:drawing>
           <wp:inline xmlns:a="http://schemas.openxmlformats.org/drawingml/2006/main" xmlns:pic="http://schemas.openxmlformats.org/drawingml/2006/picture">
             <wp:extent cx="5303520" cy="3314700"/>
-            <wp:docPr id="6" name="Picture 6"/>
+            <wp:docPr id="7" name="Picture 7"/>
             <wp:cNvGraphicFramePr>
               <a:graphicFrameLocks noChangeAspect="1"/>
             </wp:cNvGraphicFramePr>
@@ -1565,7 +1591,7 @@
                     <pic:cNvPicPr/>
                   </pic:nvPicPr>
                   <pic:blipFill>
-                    <a:blip r:embed="rId14"/>
+                    <a:blip r:embed="rId15"/>
                     <a:stretch>
                       <a:fillRect/>
                     </a:stretch>
@@ -1610,7 +1636,7 @@
         <w:drawing>
           <wp:inline xmlns:a="http://schemas.openxmlformats.org/drawingml/2006/main" xmlns:pic="http://schemas.openxmlformats.org/drawingml/2006/picture">
             <wp:extent cx="5303520" cy="3314700"/>
-            <wp:docPr id="7" name="Picture 7"/>
+            <wp:docPr id="8" name="Picture 8"/>
             <wp:cNvGraphicFramePr>
               <a:graphicFrameLocks noChangeAspect="1"/>
             </wp:cNvGraphicFramePr>
@@ -1622,7 +1648,7 @@
                     <pic:cNvPicPr/>
                   </pic:nvPicPr>
                   <pic:blipFill>
-                    <a:blip r:embed="rId15"/>
+                    <a:blip r:embed="rId16"/>
                     <a:stretch>
                       <a:fillRect/>
                     </a:stretch>

</xml_diff>